<commit_message>
Update Final Interim Report - Drowziness Detection.docx
</commit_message>
<xml_diff>
--- a/Final Interim Report - Drowziness Detection.docx
+++ b/Final Interim Report - Drowziness Detection.docx
@@ -3053,6 +3053,7 @@
       </w:pPr>
       <w:r>
         <w:rPr>
+          <w:noProof/>
           <w:sz w:val="24"/>
           <w:szCs w:val="24"/>
           <w:u w:val="single"/>
@@ -4113,16 +4114,50 @@
           <w:sz w:val="24"/>
           <w:szCs w:val="24"/>
         </w:rPr>
-        <w:t>The dashboard, dataset and jupyter notebooks could be accessed through the github repository:</w:t>
-      </w:r>
-    </w:p>
-    <w:p>
-      <w:pPr>
-        <w:jc w:val="both"/>
-        <w:rPr>
-          <w:u w:val="single"/>
-        </w:rPr>
-      </w:pPr>
+        <w:t xml:space="preserve">The dashboard, dataset and </w:t>
+      </w:r>
+      <w:r>
+        <w:rPr>
+          <w:sz w:val="24"/>
+          <w:szCs w:val="24"/>
+        </w:rPr>
+        <w:t>Jupiter</w:t>
+      </w:r>
+      <w:r>
+        <w:rPr>
+          <w:sz w:val="24"/>
+          <w:szCs w:val="24"/>
+        </w:rPr>
+        <w:t xml:space="preserve"> notebook could be accessed through the </w:t>
+      </w:r>
+      <w:r>
+        <w:rPr>
+          <w:sz w:val="24"/>
+          <w:szCs w:val="24"/>
+        </w:rPr>
+        <w:t>GitHub</w:t>
+      </w:r>
+      <w:r>
+        <w:rPr>
+          <w:sz w:val="24"/>
+          <w:szCs w:val="24"/>
+        </w:rPr>
+        <w:t xml:space="preserve"> repository:</w:t>
+      </w:r>
+    </w:p>
+    <w:p>
+      <w:pPr>
+        <w:jc w:val="both"/>
+        <w:rPr>
+          <w:u w:val="single"/>
+        </w:rPr>
+      </w:pPr>
+      <w:r>
+        <w:rPr>
+          <w:u w:val="single"/>
+        </w:rPr>
+        <w:t>https://github.com/RisshhavRana/Capstone-Project---Group-3</w:t>
+      </w:r>
     </w:p>
     <w:sectPr>
       <w:pgSz w:w="12240" w:h="15840"/>

</xml_diff>